<commit_message>
Serial set, but down
</commit_message>
<xml_diff>
--- a/Task6-7/Практика 6-7. Синицкая.docx
+++ b/Task6-7/Практика 6-7. Синицкая.docx
@@ -2006,77 +2006,75 @@
                 <w:szCs w:val="24"/>
                 <w:lang w:val="en-US" w:eastAsia="ru-RU"/>
               </w:rPr>
-              <w:t xml:space="preserve">R0(config)#crypto key generate </w:t>
-            </w:r>
-            <w:proofErr w:type="spellStart"/>
-            <w:r>
+              <w:t>R0(config)#crypto key generate rsa</w:t>
+            </w:r>
+          </w:p>
+          <w:p>
+            <w:pPr>
               <w:rPr>
                 <w:rFonts w:ascii="Times New Roman" w:eastAsia="Times New Roman" w:hAnsi="Times New Roman" w:cs="Times New Roman"/>
                 <w:sz w:val="24"/>
                 <w:szCs w:val="24"/>
                 <w:lang w:val="en-US" w:eastAsia="ru-RU"/>
               </w:rPr>
-              <w:t>rsa</w:t>
-            </w:r>
-            <w:proofErr w:type="spellEnd"/>
-          </w:p>
-          <w:p>
-            <w:pPr>
+            </w:pPr>
+            <w:r>
               <w:rPr>
                 <w:rFonts w:ascii="Times New Roman" w:eastAsia="Times New Roman" w:hAnsi="Times New Roman" w:cs="Times New Roman"/>
                 <w:sz w:val="24"/>
                 <w:szCs w:val="24"/>
                 <w:lang w:val="en-US" w:eastAsia="ru-RU"/>
               </w:rPr>
-            </w:pPr>
-            <w:r>
+              <w:t>% Please define a domain-name first.</w:t>
+            </w:r>
+          </w:p>
+          <w:p>
+            <w:pPr>
               <w:rPr>
                 <w:rFonts w:ascii="Times New Roman" w:eastAsia="Times New Roman" w:hAnsi="Times New Roman" w:cs="Times New Roman"/>
                 <w:sz w:val="24"/>
                 <w:szCs w:val="24"/>
                 <w:lang w:val="en-US" w:eastAsia="ru-RU"/>
               </w:rPr>
-              <w:t>% Please define a domain-name first.</w:t>
-            </w:r>
-          </w:p>
-          <w:p>
-            <w:pPr>
+            </w:pPr>
+            <w:r>
               <w:rPr>
                 <w:rFonts w:ascii="Times New Roman" w:eastAsia="Times New Roman" w:hAnsi="Times New Roman" w:cs="Times New Roman"/>
                 <w:sz w:val="24"/>
                 <w:szCs w:val="24"/>
                 <w:lang w:val="en-US" w:eastAsia="ru-RU"/>
               </w:rPr>
-            </w:pPr>
-            <w:r>
+              <w:t>R0(config)#hostname Router0</w:t>
+            </w:r>
+          </w:p>
+          <w:p>
+            <w:pPr>
               <w:rPr>
                 <w:rFonts w:ascii="Times New Roman" w:eastAsia="Times New Roman" w:hAnsi="Times New Roman" w:cs="Times New Roman"/>
                 <w:sz w:val="24"/>
                 <w:szCs w:val="24"/>
                 <w:lang w:val="en-US" w:eastAsia="ru-RU"/>
               </w:rPr>
-              <w:t>R0(config)#hostname Router0</w:t>
-            </w:r>
-          </w:p>
-          <w:p>
-            <w:pPr>
+            </w:pPr>
+            <w:r>
               <w:rPr>
                 <w:rFonts w:ascii="Times New Roman" w:eastAsia="Times New Roman" w:hAnsi="Times New Roman" w:cs="Times New Roman"/>
                 <w:sz w:val="24"/>
                 <w:szCs w:val="24"/>
                 <w:lang w:val="en-US" w:eastAsia="ru-RU"/>
               </w:rPr>
-            </w:pPr>
-            <w:r>
+              <w:t>Router0(config)#ip domain-name company.local</w:t>
+            </w:r>
+          </w:p>
+          <w:p>
+            <w:pPr>
               <w:rPr>
                 <w:rFonts w:ascii="Times New Roman" w:eastAsia="Times New Roman" w:hAnsi="Times New Roman" w:cs="Times New Roman"/>
                 <w:sz w:val="24"/>
                 <w:szCs w:val="24"/>
                 <w:lang w:val="en-US" w:eastAsia="ru-RU"/>
               </w:rPr>
-              <w:t xml:space="preserve">Router0(config)#ip domain-name </w:t>
-            </w:r>
-            <w:proofErr w:type="spellStart"/>
+            </w:pPr>
             <w:r>
               <w:rPr>
                 <w:rFonts w:ascii="Times New Roman" w:eastAsia="Times New Roman" w:hAnsi="Times New Roman" w:cs="Times New Roman"/>
@@ -2084,9 +2082,8 @@
                 <w:szCs w:val="24"/>
                 <w:lang w:val="en-US" w:eastAsia="ru-RU"/>
               </w:rPr>
-              <w:t>company.local</w:t>
-            </w:r>
-            <w:proofErr w:type="spellEnd"/>
+              <w:t>Router0(config)#crypto key generate rsa</w:t>
+            </w:r>
           </w:p>
           <w:p>
             <w:pPr>
@@ -2104,76 +2101,75 @@
                 <w:szCs w:val="24"/>
                 <w:lang w:val="en-US" w:eastAsia="ru-RU"/>
               </w:rPr>
-              <w:t xml:space="preserve">Router0(config)#crypto key generate </w:t>
-            </w:r>
-            <w:proofErr w:type="spellStart"/>
-            <w:r>
+              <w:t>The name for the keys will be: Router0.company.local</w:t>
+            </w:r>
+          </w:p>
+          <w:p>
+            <w:pPr>
               <w:rPr>
                 <w:rFonts w:ascii="Times New Roman" w:eastAsia="Times New Roman" w:hAnsi="Times New Roman" w:cs="Times New Roman"/>
                 <w:sz w:val="24"/>
                 <w:szCs w:val="24"/>
                 <w:lang w:val="en-US" w:eastAsia="ru-RU"/>
               </w:rPr>
-              <w:t>rsa</w:t>
-            </w:r>
-            <w:proofErr w:type="spellEnd"/>
-          </w:p>
-          <w:p>
-            <w:pPr>
+            </w:pPr>
+            <w:r>
               <w:rPr>
                 <w:rFonts w:ascii="Times New Roman" w:eastAsia="Times New Roman" w:hAnsi="Times New Roman" w:cs="Times New Roman"/>
                 <w:sz w:val="24"/>
                 <w:szCs w:val="24"/>
                 <w:lang w:val="en-US" w:eastAsia="ru-RU"/>
               </w:rPr>
-            </w:pPr>
-            <w:r>
+              <w:t>Choose the size of the key modulus in the range of 360 to 4096 for your</w:t>
+            </w:r>
+          </w:p>
+          <w:p>
+            <w:pPr>
               <w:rPr>
                 <w:rFonts w:ascii="Times New Roman" w:eastAsia="Times New Roman" w:hAnsi="Times New Roman" w:cs="Times New Roman"/>
                 <w:sz w:val="24"/>
                 <w:szCs w:val="24"/>
                 <w:lang w:val="en-US" w:eastAsia="ru-RU"/>
               </w:rPr>
-              <w:t>The name for the keys will be: Router0.company.local</w:t>
-            </w:r>
-          </w:p>
-          <w:p>
-            <w:pPr>
+            </w:pPr>
+            <w:r>
               <w:rPr>
                 <w:rFonts w:ascii="Times New Roman" w:eastAsia="Times New Roman" w:hAnsi="Times New Roman" w:cs="Times New Roman"/>
                 <w:sz w:val="24"/>
                 <w:szCs w:val="24"/>
                 <w:lang w:val="en-US" w:eastAsia="ru-RU"/>
               </w:rPr>
-            </w:pPr>
-            <w:r>
+              <w:t>General Purpose Keys. Choosing a key modulus greater than 512 may take</w:t>
+            </w:r>
+          </w:p>
+          <w:p>
+            <w:pPr>
               <w:rPr>
                 <w:rFonts w:ascii="Times New Roman" w:eastAsia="Times New Roman" w:hAnsi="Times New Roman" w:cs="Times New Roman"/>
                 <w:sz w:val="24"/>
                 <w:szCs w:val="24"/>
                 <w:lang w:val="en-US" w:eastAsia="ru-RU"/>
               </w:rPr>
-              <w:t>Choose the size of the key modulus in the range of 360 to 4096 for your</w:t>
-            </w:r>
-          </w:p>
-          <w:p>
-            <w:pPr>
+            </w:pPr>
+            <w:r>
               <w:rPr>
                 <w:rFonts w:ascii="Times New Roman" w:eastAsia="Times New Roman" w:hAnsi="Times New Roman" w:cs="Times New Roman"/>
                 <w:sz w:val="24"/>
                 <w:szCs w:val="24"/>
                 <w:lang w:val="en-US" w:eastAsia="ru-RU"/>
               </w:rPr>
-            </w:pPr>
-            <w:r>
+              <w:t>a few minutes.</w:t>
+            </w:r>
+          </w:p>
+          <w:p>
+            <w:pPr>
               <w:rPr>
                 <w:rFonts w:ascii="Times New Roman" w:eastAsia="Times New Roman" w:hAnsi="Times New Roman" w:cs="Times New Roman"/>
                 <w:sz w:val="24"/>
                 <w:szCs w:val="24"/>
                 <w:lang w:val="en-US" w:eastAsia="ru-RU"/>
               </w:rPr>
-              <w:t>General Purpose Keys. Choosing a key modulus greater than 512 may take</w:t>
-            </w:r>
+            </w:pPr>
           </w:p>
           <w:p>
             <w:pPr>
@@ -2191,7 +2187,7 @@
                 <w:szCs w:val="24"/>
                 <w:lang w:val="en-US" w:eastAsia="ru-RU"/>
               </w:rPr>
-              <w:t>a few minutes.</w:t>
+              <w:t>How many bits in the modulus [512]: 1024</w:t>
             </w:r>
           </w:p>
           <w:p>
@@ -2203,25 +2199,25 @@
                 <w:lang w:val="en-US" w:eastAsia="ru-RU"/>
               </w:rPr>
             </w:pPr>
-          </w:p>
-          <w:p>
-            <w:pPr>
+            <w:r>
               <w:rPr>
                 <w:rFonts w:ascii="Times New Roman" w:eastAsia="Times New Roman" w:hAnsi="Times New Roman" w:cs="Times New Roman"/>
                 <w:sz w:val="24"/>
                 <w:szCs w:val="24"/>
                 <w:lang w:val="en-US" w:eastAsia="ru-RU"/>
               </w:rPr>
-            </w:pPr>
-            <w:r>
+              <w:t>% Generating 1024 bit RSA keys, keys will be non-exportable...[OK]</w:t>
+            </w:r>
+          </w:p>
+          <w:p>
+            <w:pPr>
               <w:rPr>
                 <w:rFonts w:ascii="Times New Roman" w:eastAsia="Times New Roman" w:hAnsi="Times New Roman" w:cs="Times New Roman"/>
                 <w:sz w:val="24"/>
                 <w:szCs w:val="24"/>
                 <w:lang w:val="en-US" w:eastAsia="ru-RU"/>
               </w:rPr>
-              <w:t>How many bits in the modulus [512]: 1024</w:t>
-            </w:r>
+            </w:pPr>
           </w:p>
           <w:p>
             <w:pPr>
@@ -2239,7 +2235,7 @@
                 <w:szCs w:val="24"/>
                 <w:lang w:val="en-US" w:eastAsia="ru-RU"/>
               </w:rPr>
-              <w:t>% Generating 1024 bit RSA keys, keys will be non-exportable...[OK]</w:t>
+              <w:t>Router0(config)#username admin privilege 15 secret SecurePass2025</w:t>
             </w:r>
           </w:p>
           <w:p>
@@ -2251,64 +2247,63 @@
                 <w:lang w:val="en-US" w:eastAsia="ru-RU"/>
               </w:rPr>
             </w:pPr>
-          </w:p>
-          <w:p>
-            <w:pPr>
+            <w:r>
               <w:rPr>
                 <w:rFonts w:ascii="Times New Roman" w:eastAsia="Times New Roman" w:hAnsi="Times New Roman" w:cs="Times New Roman"/>
                 <w:sz w:val="24"/>
                 <w:szCs w:val="24"/>
                 <w:lang w:val="en-US" w:eastAsia="ru-RU"/>
               </w:rPr>
-            </w:pPr>
-            <w:r>
+              <w:t>*Mar 1 0:21:31.293: %SSH-5-ENABLED: SSH 1.99 has been enabled</w:t>
+            </w:r>
+          </w:p>
+          <w:p>
+            <w:pPr>
               <w:rPr>
                 <w:rFonts w:ascii="Times New Roman" w:eastAsia="Times New Roman" w:hAnsi="Times New Roman" w:cs="Times New Roman"/>
                 <w:sz w:val="24"/>
                 <w:szCs w:val="24"/>
                 <w:lang w:val="en-US" w:eastAsia="ru-RU"/>
               </w:rPr>
-              <w:t>Router0(config)#username admin privilege 15 secret SecurePass2025</w:t>
-            </w:r>
-          </w:p>
-          <w:p>
-            <w:pPr>
+            </w:pPr>
+            <w:r>
               <w:rPr>
                 <w:rFonts w:ascii="Times New Roman" w:eastAsia="Times New Roman" w:hAnsi="Times New Roman" w:cs="Times New Roman"/>
                 <w:sz w:val="24"/>
                 <w:szCs w:val="24"/>
                 <w:lang w:val="en-US" w:eastAsia="ru-RU"/>
               </w:rPr>
-            </w:pPr>
-            <w:r>
+              <w:t>Router0(config)#line vty 0 4</w:t>
+            </w:r>
+          </w:p>
+          <w:p>
+            <w:pPr>
               <w:rPr>
                 <w:rFonts w:ascii="Times New Roman" w:eastAsia="Times New Roman" w:hAnsi="Times New Roman" w:cs="Times New Roman"/>
                 <w:sz w:val="24"/>
                 <w:szCs w:val="24"/>
                 <w:lang w:val="en-US" w:eastAsia="ru-RU"/>
               </w:rPr>
-              <w:t>*Mar 1 0:21:31.293: %SSH-5-ENABLED: SSH 1.99 has been enabled</w:t>
-            </w:r>
-          </w:p>
-          <w:p>
-            <w:pPr>
+            </w:pPr>
+            <w:r>
               <w:rPr>
                 <w:rFonts w:ascii="Times New Roman" w:eastAsia="Times New Roman" w:hAnsi="Times New Roman" w:cs="Times New Roman"/>
                 <w:sz w:val="24"/>
                 <w:szCs w:val="24"/>
                 <w:lang w:val="en-US" w:eastAsia="ru-RU"/>
               </w:rPr>
-            </w:pPr>
-            <w:r>
+              <w:t>Router0(config-line)# login local</w:t>
+            </w:r>
+          </w:p>
+          <w:p>
+            <w:pPr>
               <w:rPr>
                 <w:rFonts w:ascii="Times New Roman" w:eastAsia="Times New Roman" w:hAnsi="Times New Roman" w:cs="Times New Roman"/>
                 <w:sz w:val="24"/>
                 <w:szCs w:val="24"/>
                 <w:lang w:val="en-US" w:eastAsia="ru-RU"/>
               </w:rPr>
-              <w:t xml:space="preserve">Router0(config)#line </w:t>
-            </w:r>
-            <w:proofErr w:type="spellStart"/>
+            </w:pPr>
             <w:r>
               <w:rPr>
                 <w:rFonts w:ascii="Times New Roman" w:eastAsia="Times New Roman" w:hAnsi="Times New Roman" w:cs="Times New Roman"/>
@@ -2316,191 +2311,103 @@
                 <w:szCs w:val="24"/>
                 <w:lang w:val="en-US" w:eastAsia="ru-RU"/>
               </w:rPr>
-              <w:t>vty</w:t>
-            </w:r>
-            <w:proofErr w:type="spellEnd"/>
-            <w:r>
+              <w:t>Router0(config-line)# transport input ssh</w:t>
+            </w:r>
+          </w:p>
+          <w:p>
+            <w:pPr>
               <w:rPr>
                 <w:rFonts w:ascii="Times New Roman" w:eastAsia="Times New Roman" w:hAnsi="Times New Roman" w:cs="Times New Roman"/>
                 <w:sz w:val="24"/>
                 <w:szCs w:val="24"/>
                 <w:lang w:val="en-US" w:eastAsia="ru-RU"/>
               </w:rPr>
-              <w:t xml:space="preserve"> 0 4</w:t>
-            </w:r>
-          </w:p>
-          <w:p>
-            <w:pPr>
+            </w:pPr>
+            <w:r>
               <w:rPr>
                 <w:rFonts w:ascii="Times New Roman" w:eastAsia="Times New Roman" w:hAnsi="Times New Roman" w:cs="Times New Roman"/>
                 <w:sz w:val="24"/>
                 <w:szCs w:val="24"/>
                 <w:lang w:val="en-US" w:eastAsia="ru-RU"/>
               </w:rPr>
-            </w:pPr>
-            <w:r>
+              <w:t>Router0(config-line)#exit</w:t>
+            </w:r>
+          </w:p>
+          <w:p>
+            <w:pPr>
               <w:rPr>
                 <w:rFonts w:ascii="Times New Roman" w:eastAsia="Times New Roman" w:hAnsi="Times New Roman" w:cs="Times New Roman"/>
                 <w:sz w:val="24"/>
                 <w:szCs w:val="24"/>
                 <w:lang w:val="en-US" w:eastAsia="ru-RU"/>
               </w:rPr>
-              <w:t>Router0(config-line)# login local</w:t>
-            </w:r>
-          </w:p>
-          <w:p>
-            <w:pPr>
+            </w:pPr>
+            <w:r>
               <w:rPr>
                 <w:rFonts w:ascii="Times New Roman" w:eastAsia="Times New Roman" w:hAnsi="Times New Roman" w:cs="Times New Roman"/>
                 <w:sz w:val="24"/>
                 <w:szCs w:val="24"/>
                 <w:lang w:val="en-US" w:eastAsia="ru-RU"/>
               </w:rPr>
-            </w:pPr>
-            <w:r>
+              <w:t>Router0(config)#enable secret Enable$2025</w:t>
+            </w:r>
+          </w:p>
+          <w:p>
+            <w:pPr>
               <w:rPr>
                 <w:rFonts w:ascii="Times New Roman" w:eastAsia="Times New Roman" w:hAnsi="Times New Roman" w:cs="Times New Roman"/>
                 <w:sz w:val="24"/>
                 <w:szCs w:val="24"/>
                 <w:lang w:val="en-US" w:eastAsia="ru-RU"/>
               </w:rPr>
-              <w:t>Router0(config-line)# transport input ssh</w:t>
-            </w:r>
-          </w:p>
-          <w:p>
-            <w:pPr>
+            </w:pPr>
+            <w:r>
               <w:rPr>
                 <w:rFonts w:ascii="Times New Roman" w:eastAsia="Times New Roman" w:hAnsi="Times New Roman" w:cs="Times New Roman"/>
                 <w:sz w:val="24"/>
                 <w:szCs w:val="24"/>
                 <w:lang w:val="en-US" w:eastAsia="ru-RU"/>
               </w:rPr>
-            </w:pPr>
-            <w:r>
+              <w:t>Router0(config)#service password-encryption</w:t>
+            </w:r>
+          </w:p>
+          <w:p>
+            <w:pPr>
               <w:rPr>
                 <w:rFonts w:ascii="Times New Roman" w:eastAsia="Times New Roman" w:hAnsi="Times New Roman" w:cs="Times New Roman"/>
                 <w:sz w:val="24"/>
                 <w:szCs w:val="24"/>
                 <w:lang w:val="en-US" w:eastAsia="ru-RU"/>
               </w:rPr>
-              <w:t>Router0(config-line)#exit</w:t>
-            </w:r>
-          </w:p>
-          <w:p>
-            <w:pPr>
+            </w:pPr>
+            <w:r>
               <w:rPr>
                 <w:rFonts w:ascii="Times New Roman" w:eastAsia="Times New Roman" w:hAnsi="Times New Roman" w:cs="Times New Roman"/>
                 <w:sz w:val="24"/>
                 <w:szCs w:val="24"/>
                 <w:lang w:val="en-US" w:eastAsia="ru-RU"/>
               </w:rPr>
-            </w:pPr>
-            <w:r>
+              <w:t>Router0(config)#banner motd # Authorized access only! #</w:t>
+            </w:r>
+          </w:p>
+          <w:p>
+            <w:pPr>
               <w:rPr>
                 <w:rFonts w:ascii="Times New Roman" w:eastAsia="Times New Roman" w:hAnsi="Times New Roman" w:cs="Times New Roman"/>
                 <w:sz w:val="24"/>
                 <w:szCs w:val="24"/>
                 <w:lang w:val="en-US" w:eastAsia="ru-RU"/>
               </w:rPr>
-              <w:t>Router0(config)#enable secret Enable$2025</w:t>
-            </w:r>
-          </w:p>
-          <w:p>
-            <w:pPr>
+            </w:pPr>
+            <w:r>
               <w:rPr>
                 <w:rFonts w:ascii="Times New Roman" w:eastAsia="Times New Roman" w:hAnsi="Times New Roman" w:cs="Times New Roman"/>
                 <w:sz w:val="24"/>
                 <w:szCs w:val="24"/>
                 <w:lang w:val="en-US" w:eastAsia="ru-RU"/>
               </w:rPr>
-            </w:pPr>
-            <w:r>
-              <w:rPr>
-                <w:rFonts w:ascii="Times New Roman" w:eastAsia="Times New Roman" w:hAnsi="Times New Roman" w:cs="Times New Roman"/>
-                <w:sz w:val="24"/>
-                <w:szCs w:val="24"/>
-                <w:lang w:val="en-US" w:eastAsia="ru-RU"/>
-              </w:rPr>
-              <w:t>Router0(config)#service password-encryption</w:t>
-            </w:r>
-          </w:p>
-          <w:p>
-            <w:pPr>
-              <w:rPr>
-                <w:rFonts w:ascii="Times New Roman" w:eastAsia="Times New Roman" w:hAnsi="Times New Roman" w:cs="Times New Roman"/>
-                <w:sz w:val="24"/>
-                <w:szCs w:val="24"/>
-                <w:lang w:val="en-US" w:eastAsia="ru-RU"/>
-              </w:rPr>
-            </w:pPr>
-            <w:r>
-              <w:rPr>
-                <w:rFonts w:ascii="Times New Roman" w:eastAsia="Times New Roman" w:hAnsi="Times New Roman" w:cs="Times New Roman"/>
-                <w:sz w:val="24"/>
-                <w:szCs w:val="24"/>
-                <w:lang w:val="en-US" w:eastAsia="ru-RU"/>
-              </w:rPr>
-              <w:t xml:space="preserve">Router0(config)#banner </w:t>
-            </w:r>
-            <w:proofErr w:type="spellStart"/>
-            <w:r>
-              <w:rPr>
-                <w:rFonts w:ascii="Times New Roman" w:eastAsia="Times New Roman" w:hAnsi="Times New Roman" w:cs="Times New Roman"/>
-                <w:sz w:val="24"/>
-                <w:szCs w:val="24"/>
-                <w:lang w:val="en-US" w:eastAsia="ru-RU"/>
-              </w:rPr>
-              <w:t>motd</w:t>
-            </w:r>
-            <w:proofErr w:type="spellEnd"/>
-            <w:r>
-              <w:rPr>
-                <w:rFonts w:ascii="Times New Roman" w:eastAsia="Times New Roman" w:hAnsi="Times New Roman" w:cs="Times New Roman"/>
-                <w:sz w:val="24"/>
-                <w:szCs w:val="24"/>
-                <w:lang w:val="en-US" w:eastAsia="ru-RU"/>
-              </w:rPr>
-              <w:t xml:space="preserve"> # Authorized access only! #</w:t>
-            </w:r>
-          </w:p>
-          <w:p>
-            <w:pPr>
-              <w:rPr>
-                <w:rFonts w:ascii="Times New Roman" w:eastAsia="Times New Roman" w:hAnsi="Times New Roman" w:cs="Times New Roman"/>
-                <w:sz w:val="24"/>
-                <w:szCs w:val="24"/>
-                <w:lang w:val="en-US" w:eastAsia="ru-RU"/>
-              </w:rPr>
-            </w:pPr>
-            <w:r>
-              <w:rPr>
-                <w:rFonts w:ascii="Times New Roman" w:eastAsia="Times New Roman" w:hAnsi="Times New Roman" w:cs="Times New Roman"/>
-                <w:sz w:val="24"/>
-                <w:szCs w:val="24"/>
-                <w:lang w:val="en-US" w:eastAsia="ru-RU"/>
-              </w:rPr>
               <w:lastRenderedPageBreak/>
-              <w:t xml:space="preserve">Router0(config)#no </w:t>
-            </w:r>
-            <w:proofErr w:type="spellStart"/>
-            <w:r>
-              <w:rPr>
-                <w:rFonts w:ascii="Times New Roman" w:eastAsia="Times New Roman" w:hAnsi="Times New Roman" w:cs="Times New Roman"/>
-                <w:sz w:val="24"/>
-                <w:szCs w:val="24"/>
-                <w:lang w:val="en-US" w:eastAsia="ru-RU"/>
-              </w:rPr>
-              <w:t>ip</w:t>
-            </w:r>
-            <w:proofErr w:type="spellEnd"/>
-            <w:r>
-              <w:rPr>
-                <w:rFonts w:ascii="Times New Roman" w:eastAsia="Times New Roman" w:hAnsi="Times New Roman" w:cs="Times New Roman"/>
-                <w:sz w:val="24"/>
-                <w:szCs w:val="24"/>
-                <w:lang w:val="en-US" w:eastAsia="ru-RU"/>
-              </w:rPr>
-              <w:t xml:space="preserve"> domain-lookup</w:t>
+              <w:t>Router0(config)#no ip domain-lookup</w:t>
             </w:r>
           </w:p>
           <w:p>
@@ -2648,11 +2555,145 @@
         <w:pStyle w:val="aff8"/>
         <w:ind w:firstLine="0"/>
         <w:jc w:val="center"/>
+        <w:rPr>
+          <w:lang w:val="en-US"/>
+        </w:rPr>
+      </w:pPr>
+      <w:r>
+        <w:drawing>
+          <wp:inline distT="0" distB="0" distL="0" distR="0" wp14:anchorId="041DF8E1" wp14:editId="6218E1AD">
+            <wp:extent cx="5940425" cy="4479290"/>
+            <wp:effectExtent l="0" t="0" r="3175" b="0"/>
+            <wp:docPr id="917577224" name="Рисунок 1"/>
+            <wp:cNvGraphicFramePr>
+              <a:graphicFrameLocks xmlns:a="http://schemas.openxmlformats.org/drawingml/2006/main" noChangeAspect="1"/>
+            </wp:cNvGraphicFramePr>
+            <a:graphic xmlns:a="http://schemas.openxmlformats.org/drawingml/2006/main">
+              <a:graphicData uri="http://schemas.openxmlformats.org/drawingml/2006/picture">
+                <pic:pic xmlns:pic="http://schemas.openxmlformats.org/drawingml/2006/picture">
+                  <pic:nvPicPr>
+                    <pic:cNvPr id="917577224" name=""/>
+                    <pic:cNvPicPr/>
+                  </pic:nvPicPr>
+                  <pic:blipFill>
+                    <a:blip r:embed="rId12"/>
+                    <a:stretch>
+                      <a:fillRect/>
+                    </a:stretch>
+                  </pic:blipFill>
+                  <pic:spPr>
+                    <a:xfrm>
+                      <a:off x="0" y="0"/>
+                      <a:ext cx="5940425" cy="4479290"/>
+                    </a:xfrm>
+                    <a:prstGeom prst="rect">
+                      <a:avLst/>
+                    </a:prstGeom>
+                  </pic:spPr>
+                </pic:pic>
+              </a:graphicData>
+            </a:graphic>
+          </wp:inline>
+        </w:drawing>
+      </w:r>
+    </w:p>
+    <w:p>
+      <w:pPr>
+        <w:pStyle w:val="aff8"/>
+        <w:ind w:firstLine="0"/>
+        <w:jc w:val="center"/>
+        <w:rPr>
+          <w:lang w:val="en-US"/>
+        </w:rPr>
+      </w:pPr>
+      <w:r>
+        <w:t xml:space="preserve">Рисунок </w:t>
+      </w:r>
+      <w:r>
+        <w:t>3</w:t>
+      </w:r>
+      <w:r>
+        <w:t>.</w:t>
+      </w:r>
+      <w:r>
+        <w:t xml:space="preserve"> </w:t>
+      </w:r>
+      <w:r>
+        <w:t xml:space="preserve">Настройка </w:t>
+      </w:r>
+      <w:r>
+        <w:rPr>
+          <w:lang w:val="en-US"/>
+        </w:rPr>
+        <w:t>Serial</w:t>
+      </w:r>
+      <w:r>
+        <w:t xml:space="preserve">0/3/0 </w:t>
+      </w:r>
+      <w:r>
+        <w:t xml:space="preserve">на </w:t>
+      </w:r>
+      <w:r>
+        <w:rPr>
+          <w:lang w:val="en-US"/>
+        </w:rPr>
+        <w:t>R0</w:t>
+      </w:r>
+    </w:p>
+    <w:p>
+      <w:pPr>
+        <w:pStyle w:val="aff8"/>
+        <w:ind w:firstLine="0"/>
+        <w:jc w:val="center"/>
+      </w:pPr>
+      <w:r>
+        <w:drawing>
+          <wp:inline distT="0" distB="0" distL="0" distR="0" wp14:anchorId="0CD326FB" wp14:editId="54B4552D">
+            <wp:extent cx="5940425" cy="434340"/>
+            <wp:effectExtent l="0" t="0" r="3175" b="3810"/>
+            <wp:docPr id="363973733" name="Рисунок 1"/>
+            <wp:cNvGraphicFramePr>
+              <a:graphicFrameLocks xmlns:a="http://schemas.openxmlformats.org/drawingml/2006/main" noChangeAspect="1"/>
+            </wp:cNvGraphicFramePr>
+            <a:graphic xmlns:a="http://schemas.openxmlformats.org/drawingml/2006/main">
+              <a:graphicData uri="http://schemas.openxmlformats.org/drawingml/2006/picture">
+                <pic:pic xmlns:pic="http://schemas.openxmlformats.org/drawingml/2006/picture">
+                  <pic:nvPicPr>
+                    <pic:cNvPr id="363973733" name=""/>
+                    <pic:cNvPicPr/>
+                  </pic:nvPicPr>
+                  <pic:blipFill>
+                    <a:blip r:embed="rId13"/>
+                    <a:stretch>
+                      <a:fillRect/>
+                    </a:stretch>
+                  </pic:blipFill>
+                  <pic:spPr>
+                    <a:xfrm>
+                      <a:off x="0" y="0"/>
+                      <a:ext cx="5940425" cy="434340"/>
+                    </a:xfrm>
+                    <a:prstGeom prst="rect">
+                      <a:avLst/>
+                    </a:prstGeom>
+                  </pic:spPr>
+                </pic:pic>
+              </a:graphicData>
+            </a:graphic>
+          </wp:inline>
+        </w:drawing>
+      </w:r>
+    </w:p>
+    <w:p>
+      <w:pPr>
+        <w:pStyle w:val="aff8"/>
+        <w:ind w:firstLine="0"/>
+        <w:jc w:val="center"/>
       </w:pPr>
     </w:p>
     <w:sectPr>
-      <w:headerReference w:type="first" r:id="rId12"/>
-      <w:footerReference w:type="first" r:id="rId13"/>
+      <w:headerReference w:type="first" r:id="rId14"/>
+      <w:footerReference w:type="first" r:id="rId15"/>
       <w:pgSz w:w="11906" w:h="16838"/>
       <w:pgMar w:top="1134" w:right="850" w:bottom="1134" w:left="1701" w:header="709" w:footer="0" w:gutter="0"/>
       <w:pgNumType w:start="0"/>

</xml_diff>

<commit_message>
all works on 6-7
</commit_message>
<xml_diff>
--- a/Task6-7/Практика 6-7. Синицкая.docx
+++ b/Task6-7/Практика 6-7. Синицкая.docx
@@ -2645,6 +2645,9 @@
         <w:pStyle w:val="aff8"/>
         <w:ind w:firstLine="0"/>
         <w:jc w:val="center"/>
+        <w:rPr>
+          <w:lang w:val="en-US"/>
+        </w:rPr>
       </w:pPr>
       <w:r>
         <w:drawing>
@@ -2689,11 +2692,263 @@
         <w:pStyle w:val="aff8"/>
         <w:ind w:firstLine="0"/>
         <w:jc w:val="center"/>
-      </w:pPr>
+        <w:rPr>
+          <w:lang w:val="en-US"/>
+        </w:rPr>
+      </w:pPr>
+      <w:r>
+        <w:rPr>
+          <w:lang w:val="en-US"/>
+        </w:rPr>
+        <w:drawing>
+          <wp:inline distT="0" distB="0" distL="0" distR="0" wp14:anchorId="2F50D434" wp14:editId="71CDC5C3">
+            <wp:extent cx="5940425" cy="989965"/>
+            <wp:effectExtent l="0" t="0" r="3175" b="635"/>
+            <wp:docPr id="609508189" name="Рисунок 1"/>
+            <wp:cNvGraphicFramePr>
+              <a:graphicFrameLocks xmlns:a="http://schemas.openxmlformats.org/drawingml/2006/main" noChangeAspect="1"/>
+            </wp:cNvGraphicFramePr>
+            <a:graphic xmlns:a="http://schemas.openxmlformats.org/drawingml/2006/main">
+              <a:graphicData uri="http://schemas.openxmlformats.org/drawingml/2006/picture">
+                <pic:pic xmlns:pic="http://schemas.openxmlformats.org/drawingml/2006/picture">
+                  <pic:nvPicPr>
+                    <pic:cNvPr id="609508189" name=""/>
+                    <pic:cNvPicPr/>
+                  </pic:nvPicPr>
+                  <pic:blipFill>
+                    <a:blip r:embed="rId14"/>
+                    <a:stretch>
+                      <a:fillRect/>
+                    </a:stretch>
+                  </pic:blipFill>
+                  <pic:spPr>
+                    <a:xfrm>
+                      <a:off x="0" y="0"/>
+                      <a:ext cx="5940425" cy="989965"/>
+                    </a:xfrm>
+                    <a:prstGeom prst="rect">
+                      <a:avLst/>
+                    </a:prstGeom>
+                  </pic:spPr>
+                </pic:pic>
+              </a:graphicData>
+            </a:graphic>
+          </wp:inline>
+        </w:drawing>
+      </w:r>
+    </w:p>
+    <w:p>
+      <w:pPr>
+        <w:pStyle w:val="aff8"/>
+        <w:ind w:firstLine="0"/>
+        <w:jc w:val="center"/>
+        <w:rPr>
+          <w:lang w:val="en-US"/>
+        </w:rPr>
+      </w:pPr>
+    </w:p>
+    <w:p>
+      <w:pPr>
+        <w:pStyle w:val="aff8"/>
+        <w:ind w:firstLine="0"/>
+        <w:jc w:val="center"/>
+        <w:rPr>
+          <w:lang w:val="en-US"/>
+        </w:rPr>
+      </w:pPr>
+      <w:r>
+        <w:rPr>
+          <w:lang w:val="en-US"/>
+        </w:rPr>
+        <w:lastRenderedPageBreak/>
+        <w:drawing>
+          <wp:inline distT="0" distB="0" distL="0" distR="0" wp14:anchorId="46E628DC" wp14:editId="06BA5365">
+            <wp:extent cx="2514951" cy="2743583"/>
+            <wp:effectExtent l="0" t="0" r="0" b="0"/>
+            <wp:docPr id="722003549" name="Рисунок 1"/>
+            <wp:cNvGraphicFramePr>
+              <a:graphicFrameLocks xmlns:a="http://schemas.openxmlformats.org/drawingml/2006/main" noChangeAspect="1"/>
+            </wp:cNvGraphicFramePr>
+            <a:graphic xmlns:a="http://schemas.openxmlformats.org/drawingml/2006/main">
+              <a:graphicData uri="http://schemas.openxmlformats.org/drawingml/2006/picture">
+                <pic:pic xmlns:pic="http://schemas.openxmlformats.org/drawingml/2006/picture">
+                  <pic:nvPicPr>
+                    <pic:cNvPr id="722003549" name=""/>
+                    <pic:cNvPicPr/>
+                  </pic:nvPicPr>
+                  <pic:blipFill>
+                    <a:blip r:embed="rId15"/>
+                    <a:stretch>
+                      <a:fillRect/>
+                    </a:stretch>
+                  </pic:blipFill>
+                  <pic:spPr>
+                    <a:xfrm>
+                      <a:off x="0" y="0"/>
+                      <a:ext cx="2514951" cy="2743583"/>
+                    </a:xfrm>
+                    <a:prstGeom prst="rect">
+                      <a:avLst/>
+                    </a:prstGeom>
+                  </pic:spPr>
+                </pic:pic>
+              </a:graphicData>
+            </a:graphic>
+          </wp:inline>
+        </w:drawing>
+      </w:r>
+    </w:p>
+    <w:p>
+      <w:pPr>
+        <w:pStyle w:val="aff8"/>
+        <w:ind w:firstLine="0"/>
+        <w:jc w:val="center"/>
+        <w:rPr>
+          <w:lang w:val="en-US"/>
+        </w:rPr>
+      </w:pPr>
+      <w:r>
+        <w:rPr>
+          <w:lang w:val="en-US"/>
+        </w:rPr>
+        <w:drawing>
+          <wp:inline distT="0" distB="0" distL="0" distR="0" wp14:anchorId="42BCF60A" wp14:editId="67268153">
+            <wp:extent cx="5940425" cy="3906520"/>
+            <wp:effectExtent l="0" t="0" r="3175" b="0"/>
+            <wp:docPr id="584515443" name="Рисунок 1" descr="Изображение выглядит как текст, снимок экрана, Шрифт, документ&#10;&#10;Содержимое, созданное искусственным интеллектом, может быть неверным."/>
+            <wp:cNvGraphicFramePr>
+              <a:graphicFrameLocks xmlns:a="http://schemas.openxmlformats.org/drawingml/2006/main" noChangeAspect="1"/>
+            </wp:cNvGraphicFramePr>
+            <a:graphic xmlns:a="http://schemas.openxmlformats.org/drawingml/2006/main">
+              <a:graphicData uri="http://schemas.openxmlformats.org/drawingml/2006/picture">
+                <pic:pic xmlns:pic="http://schemas.openxmlformats.org/drawingml/2006/picture">
+                  <pic:nvPicPr>
+                    <pic:cNvPr id="584515443" name="Рисунок 1" descr="Изображение выглядит как текст, снимок экрана, Шрифт, документ&#10;&#10;Содержимое, созданное искусственным интеллектом, может быть неверным."/>
+                    <pic:cNvPicPr/>
+                  </pic:nvPicPr>
+                  <pic:blipFill>
+                    <a:blip r:embed="rId16"/>
+                    <a:stretch>
+                      <a:fillRect/>
+                    </a:stretch>
+                  </pic:blipFill>
+                  <pic:spPr>
+                    <a:xfrm>
+                      <a:off x="0" y="0"/>
+                      <a:ext cx="5940425" cy="3906520"/>
+                    </a:xfrm>
+                    <a:prstGeom prst="rect">
+                      <a:avLst/>
+                    </a:prstGeom>
+                  </pic:spPr>
+                </pic:pic>
+              </a:graphicData>
+            </a:graphic>
+          </wp:inline>
+        </w:drawing>
+      </w:r>
+    </w:p>
+    <w:p>
+      <w:pPr>
+        <w:pStyle w:val="aff8"/>
+        <w:ind w:firstLine="0"/>
+        <w:jc w:val="center"/>
+        <w:rPr>
+          <w:lang w:val="en-US"/>
+        </w:rPr>
+      </w:pPr>
+      <w:r>
+        <w:drawing>
+          <wp:inline distT="0" distB="0" distL="0" distR="0" wp14:anchorId="41F11804" wp14:editId="467A749B">
+            <wp:extent cx="5010849" cy="1829055"/>
+            <wp:effectExtent l="0" t="0" r="0" b="0"/>
+            <wp:docPr id="26712909" name="Рисунок 1" descr="Изображение выглядит как текст, снимок экрана, Шрифт&#10;&#10;Содержимое, созданное искусственным интеллектом, может быть неверным."/>
+            <wp:cNvGraphicFramePr>
+              <a:graphicFrameLocks xmlns:a="http://schemas.openxmlformats.org/drawingml/2006/main" noChangeAspect="1"/>
+            </wp:cNvGraphicFramePr>
+            <a:graphic xmlns:a="http://schemas.openxmlformats.org/drawingml/2006/main">
+              <a:graphicData uri="http://schemas.openxmlformats.org/drawingml/2006/picture">
+                <pic:pic xmlns:pic="http://schemas.openxmlformats.org/drawingml/2006/picture">
+                  <pic:nvPicPr>
+                    <pic:cNvPr id="26712909" name="Рисунок 1" descr="Изображение выглядит как текст, снимок экрана, Шрифт&#10;&#10;Содержимое, созданное искусственным интеллектом, может быть неверным."/>
+                    <pic:cNvPicPr/>
+                  </pic:nvPicPr>
+                  <pic:blipFill>
+                    <a:blip r:embed="rId17"/>
+                    <a:stretch>
+                      <a:fillRect/>
+                    </a:stretch>
+                  </pic:blipFill>
+                  <pic:spPr>
+                    <a:xfrm>
+                      <a:off x="0" y="0"/>
+                      <a:ext cx="5010849" cy="1829055"/>
+                    </a:xfrm>
+                    <a:prstGeom prst="rect">
+                      <a:avLst/>
+                    </a:prstGeom>
+                  </pic:spPr>
+                </pic:pic>
+              </a:graphicData>
+            </a:graphic>
+          </wp:inline>
+        </w:drawing>
+      </w:r>
+    </w:p>
+    <w:p>
+      <w:pPr>
+        <w:pStyle w:val="aff8"/>
+        <w:ind w:firstLine="0"/>
+        <w:jc w:val="center"/>
+        <w:rPr>
+          <w:lang w:val="en-US"/>
+        </w:rPr>
+      </w:pPr>
+      <w:r>
+        <w:rPr>
+          <w:lang w:val="en-US"/>
+        </w:rPr>
+        <w:lastRenderedPageBreak/>
+        <w:drawing>
+          <wp:inline distT="0" distB="0" distL="0" distR="0" wp14:anchorId="41578E39" wp14:editId="56F7FB72">
+            <wp:extent cx="5210902" cy="1838582"/>
+            <wp:effectExtent l="0" t="0" r="0" b="9525"/>
+            <wp:docPr id="658734341" name="Рисунок 1"/>
+            <wp:cNvGraphicFramePr>
+              <a:graphicFrameLocks xmlns:a="http://schemas.openxmlformats.org/drawingml/2006/main" noChangeAspect="1"/>
+            </wp:cNvGraphicFramePr>
+            <a:graphic xmlns:a="http://schemas.openxmlformats.org/drawingml/2006/main">
+              <a:graphicData uri="http://schemas.openxmlformats.org/drawingml/2006/picture">
+                <pic:pic xmlns:pic="http://schemas.openxmlformats.org/drawingml/2006/picture">
+                  <pic:nvPicPr>
+                    <pic:cNvPr id="658734341" name=""/>
+                    <pic:cNvPicPr/>
+                  </pic:nvPicPr>
+                  <pic:blipFill>
+                    <a:blip r:embed="rId18"/>
+                    <a:stretch>
+                      <a:fillRect/>
+                    </a:stretch>
+                  </pic:blipFill>
+                  <pic:spPr>
+                    <a:xfrm>
+                      <a:off x="0" y="0"/>
+                      <a:ext cx="5210902" cy="1838582"/>
+                    </a:xfrm>
+                    <a:prstGeom prst="rect">
+                      <a:avLst/>
+                    </a:prstGeom>
+                  </pic:spPr>
+                </pic:pic>
+              </a:graphicData>
+            </a:graphic>
+          </wp:inline>
+        </w:drawing>
+      </w:r>
     </w:p>
     <w:sectPr>
-      <w:headerReference w:type="first" r:id="rId14"/>
-      <w:footerReference w:type="first" r:id="rId15"/>
+      <w:headerReference w:type="first" r:id="rId19"/>
+      <w:footerReference w:type="first" r:id="rId20"/>
       <w:pgSz w:w="11906" w:h="16838"/>
       <w:pgMar w:top="1134" w:right="850" w:bottom="1134" w:left="1701" w:header="709" w:footer="0" w:gutter="0"/>
       <w:pgNumType w:start="0"/>

</xml_diff>